<commit_message>
fix(loan-document): put Quit Claim ATM Card fields back on a single line
User request: single line, slightly larger font (5.5pt -> 6.5pt)
instead of the two-line/small-font layout from the previous fix.
Verified with both short (BDO/ERMITA) and long (Banco De Oro (BDO)/
Quezon Avenue Branch) sample data via LibreOffice PDF render - long
values auto-wrap gracefully rather than overflowing, and the whole
document still fits on 1 page either way.

Co-Authored-By: Claude Sonnet 5 <noreply@anthropic.com>
</commit_message>
<xml_diff>
--- a/app/easycashbackend/templates/QUIT_CLAIM.docx
+++ b/app/easycashbackend/templates/QUIT_CLAIM.docx
@@ -580,11 +580,9 @@
             </w:pPr>
             <w:r>
               <w:rPr>
-                <w:sz w:val="11"/>
+                <w:sz w:val="13"/>
               </w:rPr>
-              <w:t xml:space="preserve">Bank: {Bank}   Branch: {Branch}</w:t>
-              <w:br/>
-              <w:t xml:space="preserve">Acct No.: {AccountNumber}   ATM No.: {ATMCardNumber}</w:t>
+              <w:t xml:space="preserve">Bank: {Bank}  Branch: {Branch}  Acct No.: {AccountNumber}  ATM No.: {ATMCardNumber}</w:t>
             </w:r>
           </w:p>
         </w:tc>

</xml_diff>